<commit_message>
CV: incorporar Preceptor como rol principal y placeholder de foto de perfil
- Encabezado del CV maestro y del CV de Instructor Náutico mencionan
  el cargo de Preceptor del Colegio Inmaculada Concepción como rol
  principal en actividad.
- Se documenta en el README la regla de que la foto y el rol de
  Preceptor deben aparecer en todas las versiones derivadas.
</commit_message>
<xml_diff>
--- a/exports/CV-Agustin-Serfaty-Instructor-Nautico.docx
+++ b/exports/CV-Agustin-Serfaty-Instructor-Nautico.docx
@@ -60,7 +60,12 @@
         <w:t xml:space="preserve">Serfaty</w:t>
       </w:r>
     </w:p>
-    <w:bookmarkStart w:id="33" w:name="agustín-serfaty"/>
+    <w:p>
+      <w:pPr>
+        <w:pStyle w:val="FirstParagraph"/>
+      </w:pPr>
+    </w:p>
+    <w:bookmarkStart w:id="35" w:name="agustín-serfaty"/>
     <w:p>
       <w:pPr>
         <w:pStyle w:val="Heading1"/>
@@ -78,13 +83,13 @@
           <w:bCs/>
           <w:b/>
         </w:rPr>
-        <w:t xml:space="preserve">Instructor de Vela (FAY · World Sailing)</w:t>
-      </w:r>
-      <w:r>
-        <w:t xml:space="preserve"> </w:t>
-      </w:r>
-      <w:r>
-        <w:t xml:space="preserve">· Timonel Yate Vela y Motor (PNA) · Guardavidas · Profesor de Educación Física</w:t>
+        <w:t xml:space="preserve">Preceptor — Colegio de la Inmaculada Concepción (Santa Fe)</w:t>
+      </w:r>
+      <w:r>
+        <w:t xml:space="preserve"> </w:t>
+      </w:r>
+      <w:r>
+        <w:t xml:space="preserve">· Instructor de Vela (FAY · World Sailing) · Timonel Yate Vela y Motor (PNA) · Guardavidas · Profesor de Educación Física</w:t>
       </w:r>
     </w:p>
     <w:p>
@@ -122,7 +127,7 @@
         <w:pStyle w:val="FirstParagraph"/>
       </w:pPr>
       <w:r>
-        <w:t xml:space="preserve">Instructor náutico con más de cinco años de experiencia en enseñanza de vela a niños y adolescentes en clase Optimist, certificado por la</w:t>
+        <w:t xml:space="preserve">Preceptor titular del Colegio de la Inmaculada Concepción de Santa Fe (cargo principal en actividad). Instructor náutico con cinco años de experiencia en enseñanza de vela a niños y adolescentes en clase Optimist (2019 – 02/2024), certificado por la</w:t>
       </w:r>
       <w:r>
         <w:t xml:space="preserve"> </w:t>
@@ -300,7 +305,7 @@
           <w:iCs/>
           <w:i/>
         </w:rPr>
-        <w:t xml:space="preserve">2019 – 02/2024</w:t>
+        <w:t xml:space="preserve">2019 – 02/2024 (5 años)</w:t>
       </w:r>
       <w:r>
         <w:t xml:space="preserve"> </w:t>
@@ -709,13 +714,62 @@
       </w:r>
     </w:p>
     <w:bookmarkEnd w:id="27"/>
-    <w:bookmarkStart w:id="28" w:name="otra-experiencia-docente-y-deportiva"/>
+    <w:bookmarkStart w:id="30" w:name="experiencia-docente-actual"/>
     <w:p>
       <w:pPr>
         <w:pStyle w:val="Heading2"/>
       </w:pPr>
       <w:r>
-        <w:t xml:space="preserve">Otra experiencia docente y deportiva</w:t>
+        <w:t xml:space="preserve">Experiencia docente actual</w:t>
+      </w:r>
+    </w:p>
+    <w:bookmarkStart w:id="28" w:name="X689cf2d3906110c7ff8378bb2666010ef36f31c"/>
+    <w:p>
+      <w:pPr>
+        <w:pStyle w:val="Heading3"/>
+      </w:pPr>
+      <w:r>
+        <w:t xml:space="preserve">Preceptor titular — Colegio de la Inmaculada Concepción, Santa Fe</w:t>
+      </w:r>
+    </w:p>
+    <w:p>
+      <w:pPr>
+        <w:pStyle w:val="FirstParagraph"/>
+      </w:pPr>
+      <w:r>
+        <w:rPr>
+          <w:iCs/>
+          <w:i/>
+        </w:rPr>
+        <w:t xml:space="preserve">03/2023 – Actualidad</w:t>
+      </w:r>
+      <w:r>
+        <w:t xml:space="preserve"> </w:t>
+      </w:r>
+      <w:r>
+        <w:t xml:space="preserve">- Acompañamiento pedagógico y disciplinar de cursos de nivel secundario en uno de los colegios de mayor tradición de la ciudad.</w:t>
+      </w:r>
+      <w:r>
+        <w:t xml:space="preserve"> </w:t>
+      </w:r>
+      <w:r>
+        <w:t xml:space="preserve">- Coordinación con docentes, dirección y familias; gestión administrativa del curso.</w:t>
+      </w:r>
+      <w:r>
+        <w:t xml:space="preserve"> </w:t>
+      </w:r>
+      <w:r>
+        <w:t xml:space="preserve">- Titularización del cargo tras desempeño como suplente.</w:t>
+      </w:r>
+    </w:p>
+    <w:bookmarkEnd w:id="28"/>
+    <w:bookmarkStart w:id="29" w:name="otra-experiencia-deportiva"/>
+    <w:p>
+      <w:pPr>
+        <w:pStyle w:val="Heading3"/>
+      </w:pPr>
+      <w:r>
+        <w:t xml:space="preserve">Otra experiencia deportiva</w:t>
       </w:r>
     </w:p>
     <w:p>
@@ -731,13 +785,13 @@
           <w:bCs/>
           <w:b/>
         </w:rPr>
-        <w:t xml:space="preserve">Preceptor titular</w:t>
-      </w:r>
-      <w:r>
-        <w:t xml:space="preserve"> </w:t>
-      </w:r>
-      <w:r>
-        <w:t xml:space="preserve">— Colegio Inmaculada Concepción, Santa Fe (03/2023 – Actualidad). Acompañamiento pedagógico y disciplinar de cursos secundarios.</w:t>
+        <w:t xml:space="preserve">Preparador Físico de Básquet (U13, U15, U17)</w:t>
+      </w:r>
+      <w:r>
+        <w:t xml:space="preserve"> </w:t>
+      </w:r>
+      <w:r>
+        <w:t xml:space="preserve">— Club Regatas Santa Fe (2024).</w:t>
       </w:r>
     </w:p>
     <w:p>
@@ -753,28 +807,6 @@
           <w:bCs/>
           <w:b/>
         </w:rPr>
-        <w:t xml:space="preserve">Preparador Físico de Básquet (U13, U15, U17)</w:t>
-      </w:r>
-      <w:r>
-        <w:t xml:space="preserve"> </w:t>
-      </w:r>
-      <w:r>
-        <w:t xml:space="preserve">— Club Regatas Santa Fe (2024).</w:t>
-      </w:r>
-    </w:p>
-    <w:p>
-      <w:pPr>
-        <w:numPr>
-          <w:ilvl w:val="0"/>
-          <w:numId w:val="1002"/>
-        </w:numPr>
-        <w:pStyle w:val="Compact"/>
-      </w:pPr>
-      <w:r>
-        <w:rPr>
-          <w:bCs/>
-          <w:b/>
-        </w:rPr>
         <w:t xml:space="preserve">Profesor de Escuelita de Rugby (4 a 7 años)</w:t>
       </w:r>
       <w:r>
@@ -791,8 +823,9 @@
         </w:pict>
       </w:r>
     </w:p>
-    <w:bookmarkEnd w:id="28"/>
-    <w:bookmarkStart w:id="29" w:name="idiomas"/>
+    <w:bookmarkEnd w:id="29"/>
+    <w:bookmarkEnd w:id="30"/>
+    <w:bookmarkStart w:id="31" w:name="idiomas"/>
     <w:p>
       <w:pPr>
         <w:pStyle w:val="Heading2"/>
@@ -874,8 +907,8 @@
         </w:pict>
       </w:r>
     </w:p>
-    <w:bookmarkEnd w:id="29"/>
-    <w:bookmarkStart w:id="30" w:name="competencias-clave-para-el-puesto"/>
+    <w:bookmarkEnd w:id="31"/>
+    <w:bookmarkStart w:id="32" w:name="competencias-clave-para-el-puesto"/>
     <w:p>
       <w:pPr>
         <w:pStyle w:val="Heading2"/>
@@ -963,8 +996,8 @@
         </w:pict>
       </w:r>
     </w:p>
-    <w:bookmarkEnd w:id="30"/>
-    <w:bookmarkStart w:id="31" w:name="experiencia-internacional"/>
+    <w:bookmarkEnd w:id="32"/>
+    <w:bookmarkStart w:id="33" w:name="experiencia-internacional"/>
     <w:p>
       <w:pPr>
         <w:pStyle w:val="Heading2"/>
@@ -1008,8 +1041,8 @@
         </w:pict>
       </w:r>
     </w:p>
-    <w:bookmarkEnd w:id="31"/>
-    <w:bookmarkStart w:id="32" w:name="referencias"/>
+    <w:bookmarkEnd w:id="33"/>
+    <w:bookmarkStart w:id="34" w:name="referencias"/>
     <w:p>
       <w:pPr>
         <w:pStyle w:val="Heading2"/>
@@ -1026,8 +1059,8 @@
         <w:t xml:space="preserve">Disponibles a pedido.</w:t>
       </w:r>
     </w:p>
-    <w:bookmarkEnd w:id="32"/>
-    <w:bookmarkEnd w:id="33"/>
+    <w:bookmarkEnd w:id="34"/>
+    <w:bookmarkEnd w:id="35"/>
     <w:sectPr/>
   </w:body>
 </w:document>

</xml_diff>

<commit_message>
Incorporar foto de perfil al CV y regenerar exports
</commit_message>
<xml_diff>
--- a/exports/CV-Agustin-Serfaty-Instructor-Nautico.docx
+++ b/exports/CV-Agustin-Serfaty-Instructor-Nautico.docx
@@ -64,8 +64,50 @@
       <w:pPr>
         <w:pStyle w:val="FirstParagraph"/>
       </w:pPr>
-    </w:p>
-    <w:bookmarkStart w:id="35" w:name="agustín-serfaty"/>
+      <w:r>
+        <w:drawing>
+          <wp:inline>
+            <wp:extent cx="1259999" cy="1362891"/>
+            <wp:effectExtent b="0" l="0" r="0" t="0"/>
+            <wp:docPr descr="" title="" id="21" name="Picture"/>
+            <a:graphic>
+              <a:graphicData uri="http://schemas.openxmlformats.org/drawingml/2006/picture">
+                <pic:pic>
+                  <pic:nvPicPr>
+                    <pic:cNvPr descr="certificaciones/foto-perfil.jpg" id="22" name="Picture"/>
+                    <pic:cNvPicPr>
+                      <a:picLocks noChangeArrowheads="1" noChangeAspect="1"/>
+                    </pic:cNvPicPr>
+                  </pic:nvPicPr>
+                  <pic:blipFill>
+                    <a:blip r:embed="rId20"/>
+                    <a:stretch>
+                      <a:fillRect/>
+                    </a:stretch>
+                  </pic:blipFill>
+                  <pic:spPr bwMode="auto">
+                    <a:xfrm>
+                      <a:off x="0" y="0"/>
+                      <a:ext cx="1259999" cy="1362891"/>
+                    </a:xfrm>
+                    <a:prstGeom prst="rect">
+                      <a:avLst/>
+                    </a:prstGeom>
+                    <a:noFill/>
+                    <a:ln w="9525">
+                      <a:noFill/>
+                      <a:headEnd/>
+                      <a:tailEnd/>
+                    </a:ln>
+                  </pic:spPr>
+                </pic:pic>
+              </a:graphicData>
+            </a:graphic>
+          </wp:inline>
+        </w:drawing>
+      </w:r>
+    </w:p>
+    <w:bookmarkStart w:id="38" w:name="agustín-serfaty"/>
     <w:p>
       <w:pPr>
         <w:pStyle w:val="Heading1"/>
@@ -113,7 +155,7 @@
         </w:pict>
       </w:r>
     </w:p>
-    <w:bookmarkStart w:id="20" w:name="perfil-profesional"/>
+    <w:bookmarkStart w:id="23" w:name="perfil-profesional"/>
     <w:p>
       <w:pPr>
         <w:pStyle w:val="Heading2"/>
@@ -153,8 +195,8 @@
         </w:pict>
       </w:r>
     </w:p>
-    <w:bookmarkEnd w:id="20"/>
-    <w:bookmarkStart w:id="21" w:name="habilitaciones-náuticas-y-de-seguridad"/>
+    <w:bookmarkEnd w:id="23"/>
+    <w:bookmarkStart w:id="24" w:name="habilitaciones-náuticas-y-de-seguridad"/>
     <w:p>
       <w:pPr>
         <w:pStyle w:val="Heading2"/>
@@ -277,8 +319,8 @@
         </w:pict>
       </w:r>
     </w:p>
-    <w:bookmarkEnd w:id="21"/>
-    <w:bookmarkStart w:id="26" w:name="experiencia-náutica-y-acuática"/>
+    <w:bookmarkEnd w:id="24"/>
+    <w:bookmarkStart w:id="29" w:name="experiencia-náutica-y-acuática"/>
     <w:p>
       <w:pPr>
         <w:pStyle w:val="Heading2"/>
@@ -287,7 +329,7 @@
         <w:t xml:space="preserve">Experiencia náutica y acuática</w:t>
       </w:r>
     </w:p>
-    <w:bookmarkStart w:id="22" w:name="X8d3c69704c9eabad9db5b31492c47998fdc8616"/>
+    <w:bookmarkStart w:id="25" w:name="X8d3c69704c9eabad9db5b31492c47998fdc8616"/>
     <w:p>
       <w:pPr>
         <w:pStyle w:val="Heading3"/>
@@ -361,8 +403,8 @@
         <w:t xml:space="preserve">- Trabajo coordinado con la escuela del club y con familias; seguimiento progresivo de los alumnos por nivel.</w:t>
       </w:r>
     </w:p>
-    <w:bookmarkEnd w:id="22"/>
-    <w:bookmarkStart w:id="23" w:name="X02657bdddece112893ec66629afc1564ccd9388"/>
+    <w:bookmarkEnd w:id="25"/>
+    <w:bookmarkStart w:id="26" w:name="X02657bdddece112893ec66629afc1564ccd9388"/>
     <w:p>
       <w:pPr>
         <w:pStyle w:val="Heading3"/>
@@ -395,8 +437,8 @@
         <w:t xml:space="preserve">- Cuidado y gestión del natatorio, prevención de accidentes y respuesta ante emergencias.</w:t>
       </w:r>
     </w:p>
-    <w:bookmarkEnd w:id="23"/>
-    <w:bookmarkStart w:id="24" w:name="X7c7fabdfd22768bc57b58c2180d706bf24e4743"/>
+    <w:bookmarkEnd w:id="26"/>
+    <w:bookmarkStart w:id="27" w:name="X7c7fabdfd22768bc57b58c2180d706bf24e4743"/>
     <w:p>
       <w:pPr>
         <w:pStyle w:val="Heading3"/>
@@ -439,8 +481,8 @@
         <w:t xml:space="preserve">(río).</w:t>
       </w:r>
     </w:p>
-    <w:bookmarkEnd w:id="24"/>
-    <w:bookmarkStart w:id="25" w:name="Xb1ff3f20707db86db3df0dec8ccbd27e6193d1a"/>
+    <w:bookmarkEnd w:id="27"/>
+    <w:bookmarkStart w:id="28" w:name="Xb1ff3f20707db86db3df0dec8ccbd27e6193d1a"/>
     <w:p>
       <w:pPr>
         <w:pStyle w:val="Heading3"/>
@@ -474,9 +516,9 @@
         </w:pict>
       </w:r>
     </w:p>
-    <w:bookmarkEnd w:id="25"/>
-    <w:bookmarkEnd w:id="26"/>
-    <w:bookmarkStart w:id="27" w:name="formación-pedagógica-y-deportiva"/>
+    <w:bookmarkEnd w:id="28"/>
+    <w:bookmarkEnd w:id="29"/>
+    <w:bookmarkStart w:id="30" w:name="formación-pedagógica-y-deportiva"/>
     <w:p>
       <w:pPr>
         <w:pStyle w:val="Heading2"/>
@@ -713,8 +755,8 @@
         </w:pict>
       </w:r>
     </w:p>
-    <w:bookmarkEnd w:id="27"/>
-    <w:bookmarkStart w:id="30" w:name="experiencia-docente-actual"/>
+    <w:bookmarkEnd w:id="30"/>
+    <w:bookmarkStart w:id="33" w:name="experiencia-docente-actual"/>
     <w:p>
       <w:pPr>
         <w:pStyle w:val="Heading2"/>
@@ -723,7 +765,7 @@
         <w:t xml:space="preserve">Experiencia docente actual</w:t>
       </w:r>
     </w:p>
-    <w:bookmarkStart w:id="28" w:name="X689cf2d3906110c7ff8378bb2666010ef36f31c"/>
+    <w:bookmarkStart w:id="31" w:name="X689cf2d3906110c7ff8378bb2666010ef36f31c"/>
     <w:p>
       <w:pPr>
         <w:pStyle w:val="Heading3"/>
@@ -762,8 +804,8 @@
         <w:t xml:space="preserve">- Titularización del cargo tras desempeño como suplente.</w:t>
       </w:r>
     </w:p>
-    <w:bookmarkEnd w:id="28"/>
-    <w:bookmarkStart w:id="29" w:name="otra-experiencia-deportiva"/>
+    <w:bookmarkEnd w:id="31"/>
+    <w:bookmarkStart w:id="32" w:name="otra-experiencia-deportiva"/>
     <w:p>
       <w:pPr>
         <w:pStyle w:val="Heading3"/>
@@ -823,9 +865,9 @@
         </w:pict>
       </w:r>
     </w:p>
-    <w:bookmarkEnd w:id="29"/>
-    <w:bookmarkEnd w:id="30"/>
-    <w:bookmarkStart w:id="31" w:name="idiomas"/>
+    <w:bookmarkEnd w:id="32"/>
+    <w:bookmarkEnd w:id="33"/>
+    <w:bookmarkStart w:id="34" w:name="idiomas"/>
     <w:p>
       <w:pPr>
         <w:pStyle w:val="Heading2"/>
@@ -907,8 +949,8 @@
         </w:pict>
       </w:r>
     </w:p>
-    <w:bookmarkEnd w:id="31"/>
-    <w:bookmarkStart w:id="32" w:name="competencias-clave-para-el-puesto"/>
+    <w:bookmarkEnd w:id="34"/>
+    <w:bookmarkStart w:id="35" w:name="competencias-clave-para-el-puesto"/>
     <w:p>
       <w:pPr>
         <w:pStyle w:val="Heading2"/>
@@ -996,8 +1038,8 @@
         </w:pict>
       </w:r>
     </w:p>
-    <w:bookmarkEnd w:id="32"/>
-    <w:bookmarkStart w:id="33" w:name="experiencia-internacional"/>
+    <w:bookmarkEnd w:id="35"/>
+    <w:bookmarkStart w:id="36" w:name="experiencia-internacional"/>
     <w:p>
       <w:pPr>
         <w:pStyle w:val="Heading2"/>
@@ -1041,8 +1083,8 @@
         </w:pict>
       </w:r>
     </w:p>
-    <w:bookmarkEnd w:id="33"/>
-    <w:bookmarkStart w:id="34" w:name="referencias"/>
+    <w:bookmarkEnd w:id="36"/>
+    <w:bookmarkStart w:id="37" w:name="referencias"/>
     <w:p>
       <w:pPr>
         <w:pStyle w:val="Heading2"/>
@@ -1059,8 +1101,8 @@
         <w:t xml:space="preserve">Disponibles a pedido.</w:t>
       </w:r>
     </w:p>
-    <w:bookmarkEnd w:id="34"/>
-    <w:bookmarkEnd w:id="35"/>
+    <w:bookmarkEnd w:id="37"/>
+    <w:bookmarkEnd w:id="38"/>
     <w:sectPr/>
   </w:body>
 </w:document>

</xml_diff>